<commit_message>
(Correction): Align Risk 6 timeline with work plan
- Changed 'February 2026 to June 2026' to 'February 2026 to October 2026' in Risk 6
- Consistency fix: Work plan states 9-month period Feb-Oct 2026
</commit_message>
<xml_diff>
--- a/Research_proposal_FINAL.docx
+++ b/Research_proposal_FINAL.docx
@@ -19488,19 +19488,7 @@
         </w:rPr>
       </w:pPr>
       <w:r>
-        <w:rPr>
-          <w:rFonts w:ascii="Times New Roman" w:hAnsi="Times New Roman" w:cs="Times New Roman"/>
-          <w:b/>
-          <w:bCs/>
-        </w:rPr>
-        <w:t>Nature of Sample Size Determination:</w:t>
-      </w:r>
-      <w:r>
-        <w:rPr>
-          <w:rFonts w:ascii="Times New Roman" w:hAnsi="Times New Roman" w:cs="Times New Roman"/>
-          <w:b/>
-        </w:rPr>
-        <w:t xml:space="preserve"> The sample size is not derived from a formal power calculation for hypothesis testing, as this research does not involve prospective randomized comparison of interventions. Rather, the sample size represents a feasibility-based target that balances practical constraints including available historical data volume at Aga Khan University Hospital, ethics approval timeline for retrospective data access, and data preparation capacity within the available research timeframe (February 2026 to June 2026).</w:t>
+        <w:t>Nature of Sample Size Determination: The sample size is not derived from a formal power calculation for hypothesis testing, as this research does not involve prospective randomized comparison of interventions. Rather, the sample size represents a feasibility-based target that balances practical constraints including available historical data volume at Aga Khan University Hospital, ethics approval timeline for retrospective data access, and data preparation capacity within the available research timeframe (February 2026 to October 2026).</w:t>
       </w:r>
     </w:p>
     <w:p>
@@ -25367,35 +25355,7 @@
         </w:rPr>
       </w:pPr>
       <w:r>
-        <w:rPr>
-          <w:rFonts w:ascii="Times New Roman" w:hAnsi="Times New Roman" w:cs="Times New Roman"/>
-          <w:b/>
-          <w:bCs/>
-        </w:rPr>
-        <w:t>Risk 6: Timeline Compression.</w:t>
-      </w:r>
-      <w:r>
-        <w:rPr>
-          <w:rFonts w:ascii="Times New Roman" w:hAnsi="Times New Roman" w:cs="Times New Roman"/>
-          <w:b/>
-        </w:rPr>
-        <w:t xml:space="preserve"> The compressed timeline (February 2026 to June 2026) leaves limited margin for unexpected delays. If model training or evaluation exceeds allocated time, the thesis submission deadline could be missed. </w:t>
-      </w:r>
-      <w:r>
-        <w:rPr>
-          <w:rFonts w:ascii="Times New Roman" w:hAnsi="Times New Roman" w:cs="Times New Roman"/>
-          <w:b/>
-          <w:i/>
-          <w:iCs/>
-        </w:rPr>
-        <w:t>Mitigation:</w:t>
-      </w:r>
-      <w:r>
-        <w:rPr>
-          <w:rFonts w:ascii="Times New Roman" w:hAnsi="Times New Roman" w:cs="Times New Roman"/>
-          <w:b/>
-        </w:rPr>
-        <w:t xml:space="preserve"> Prioritize core deliverables (trained model, fairness analysis, feasibility report) if time is limited, maintain the prototype as a fallback demonstration of concept feasibility, and compress Phase 4 evaluation activities by focusing on core metrics (AUC, sensitivity, specificity) rather than extensive ablation studies.</w:t>
+        <w:t>Risk 6: Timeline Compression. The compressed timeline (February 2026 to October 2026) leaves limited margin for unexpected delays. If model training or evaluation exceeds allocated time, the thesis submission deadline could be missed. Mitigation: Prioritize core deliverables (trained model, fairness analysis, feasibility report) if time is limited, maintain the prototype as a fallback demonstration of concept feasibility, and compress Phase 4 evaluation activities by focusing on core metrics (AUC, sensitivity, specificity) rather than extensive ablation studies.</w:t>
       </w:r>
     </w:p>
     <w:p>

</xml_diff>